<commit_message>
Update docs (.md is canonical; others are translations from pandoc)
</commit_message>
<xml_diff>
--- a/doc/AntimonyTutorial.docx
+++ b/doc/AntimonyTutorial.docx
@@ -2,7 +2,7 @@
 <file path=word/document.xml><?xml version="1.0" encoding="utf-8"?>
 <w:document xmlns:w="http://schemas.openxmlformats.org/wordprocessingml/2006/main" xmlns:m="http://schemas.openxmlformats.org/officeDocument/2006/math" xmlns:r="http://schemas.openxmlformats.org/officeDocument/2006/relationships" xmlns:o="urn:schemas-microsoft-com:office:office" xmlns:v="urn:schemas-microsoft-com:vml" xmlns:w10="urn:schemas-microsoft-com:office:word" xmlns:a="http://schemas.openxmlformats.org/drawingml/2006/main" xmlns:pic="http://schemas.openxmlformats.org/drawingml/2006/picture" xmlns:wp="http://schemas.openxmlformats.org/drawingml/2006/wordprocessingDrawing">
   <w:body>
-    <w:bookmarkStart w:id="91" w:name="antimony-reference"/>
+    <w:bookmarkStart w:id="95" w:name="antimony-reference"/>
     <w:p>
       <w:pPr>
         <w:pStyle w:val="Heading1"/>
@@ -1264,6 +1264,61 @@
     <w:p>
       <w:pPr>
         <w:pStyle w:val="FirstParagraph"/>
+      </w:pPr>
+      <w:r>
+        <w:t xml:space="preserve">The 3.1 release changed FBC support to version 3 of that package, changing</w:t>
+      </w:r>
+      <w:r>
+        <w:t xml:space="preserve"> </w:t>
+      </w:r>
+      <w:r>
+        <w:t xml:space="preserve">how FBC constraints were translated to SBML (but not changing how they</w:t>
+      </w:r>
+      <w:r>
+        <w:t xml:space="preserve"> </w:t>
+      </w:r>
+      <w:r>
+        <w:t xml:space="preserve">were declared in Antimony), and adding support for gene products, gene</w:t>
+      </w:r>
+      <w:r>
+        <w:t xml:space="preserve"> </w:t>
+      </w:r>
+      <w:r>
+        <w:t xml:space="preserve">product associations, species charges, and species chemical formulas.</w:t>
+      </w:r>
+    </w:p>
+    <w:p>
+      <w:pPr>
+        <w:pStyle w:val="BodyText"/>
+      </w:pPr>
+      <w:r>
+        <w:t xml:space="preserve">In addition,</w:t>
+      </w:r>
+      <w:r>
+        <w:t xml:space="preserve"> </w:t>
+      </w:r>
+      <w:r>
+        <w:t xml:space="preserve">‘substanceOnly’</w:t>
+      </w:r>
+      <w:r>
+        <w:t xml:space="preserve"> </w:t>
+      </w:r>
+      <w:r>
+        <w:t xml:space="preserve">species are now initialized to their SBML</w:t>
+      </w:r>
+      <w:r>
+        <w:t xml:space="preserve"> </w:t>
+      </w:r>
+      <w:r>
+        <w:t xml:space="preserve">‘initialAmount’</w:t>
+      </w:r>
+      <w:r>
+        <w:t xml:space="preserve">, so as to always have substance units.</w:t>
+      </w:r>
+    </w:p>
+    <w:p>
+      <w:pPr>
+        <w:pStyle w:val="BodyText"/>
       </w:pPr>
       <w:r>
         <w:t xml:space="preserve">The 3.0 release allows import and export of the SBML packages</w:t>
@@ -6318,7 +6373,7 @@
     </w:p>
     <w:bookmarkEnd w:id="51"/>
     <w:bookmarkEnd w:id="52"/>
-    <w:bookmarkStart w:id="76" w:name="language-reference"/>
+    <w:bookmarkStart w:id="80" w:name="language-reference"/>
     <w:p>
       <w:pPr>
         <w:pStyle w:val="Heading2"/>
@@ -6858,7 +6913,7 @@
         <w:t xml:space="preserve"> </w:t>
       </w:r>
       <w:r>
-        <w:t xml:space="preserve">still accomplished with the same syntax:</w:t>
+        <w:t xml:space="preserve">also changed:</w:t>
       </w:r>
     </w:p>
     <w:p>
@@ -6866,7 +6921,55 @@
         <w:pStyle w:val="BodyText"/>
       </w:pPr>
       <w:r>
-        <w:t xml:space="preserve">S1 = 2.5/C1;</w:t>
+        <w:t xml:space="preserve">S1 = 2.5;</w:t>
+      </w:r>
+    </w:p>
+    <w:p>
+      <w:pPr>
+        <w:pStyle w:val="BodyText"/>
+      </w:pPr>
+      <w:r>
+        <w:t xml:space="preserve">This will set the initial amount to 2.5, not the initial concentration.</w:t>
+      </w:r>
+      <w:r>
+        <w:t xml:space="preserve"> </w:t>
+      </w:r>
+      <w:r>
+        <w:t xml:space="preserve">If you wish to set the initial concentration instead, use the compartment:</w:t>
+      </w:r>
+    </w:p>
+    <w:p>
+      <w:pPr>
+        <w:pStyle w:val="BodyText"/>
+      </w:pPr>
+      <w:r>
+        <w:t xml:space="preserve">S1 = 3.1*C</w:t>
+      </w:r>
+    </w:p>
+    <w:p>
+      <w:pPr>
+        <w:pStyle w:val="BodyText"/>
+      </w:pPr>
+      <w:r>
+        <w:t xml:space="preserve">Because a concentration times the compartment volume yields an amount, in</w:t>
+      </w:r>
+      <w:r>
+        <w:t xml:space="preserve"> </w:t>
+      </w:r>
+      <w:r>
+        <w:t xml:space="preserve">this formulation,</w:t>
+      </w:r>
+      <w:r>
+        <w:t xml:space="preserve"> </w:t>
+      </w:r>
+      <w:r>
+        <w:t xml:space="preserve">‘3.1’</w:t>
+      </w:r>
+      <w:r>
+        <w:t xml:space="preserve"> </w:t>
+      </w:r>
+      <w:r>
+        <w:t xml:space="preserve">is set as the initial concentration.</w:t>
       </w:r>
     </w:p>
     <w:bookmarkEnd w:id="54"/>
@@ -14412,7 +14515,7 @@
       </w:r>
     </w:p>
     <w:bookmarkEnd w:id="71"/>
-    <w:bookmarkStart w:id="72" w:name="flux-balance-constraints"/>
+    <w:bookmarkStart w:id="76" w:name="flux-balance-constraints"/>
     <w:p>
       <w:pPr>
         <w:pStyle w:val="Heading3"/>
@@ -14421,6 +14524,15 @@
         <w:t xml:space="preserve">Flux Balance Constraints</w:t>
       </w:r>
     </w:p>
+    <w:bookmarkStart w:id="72" w:name="constraints"/>
+    <w:p>
+      <w:pPr>
+        <w:pStyle w:val="Heading4"/>
+      </w:pPr>
+      <w:r>
+        <w:t xml:space="preserve">Constraints</w:t>
+      </w:r>
+    </w:p>
     <w:p>
       <w:pPr>
         <w:pStyle w:val="FirstParagraph"/>
@@ -14607,13 +14719,29 @@
         <w:t xml:space="preserve"> </w:t>
       </w:r>
       <w:r>
-        <w:t xml:space="preserve">translated as core SBML constraints. (Flux Balance constraints are also</w:t>
-      </w:r>
-      <w:r>
-        <w:t xml:space="preserve"> </w:t>
-      </w:r>
-      <w:r>
-        <w:t xml:space="preserve">translated as core constraints, for consistency.)</w:t>
+        <w:t xml:space="preserve">translated as core SBML constraints. (Any constraint is treated as</w:t>
+      </w:r>
+      <w:r>
+        <w:t xml:space="preserve"> </w:t>
+      </w:r>
+      <w:r>
+        <w:t xml:space="preserve">either an FBC constraint</w:t>
+      </w:r>
+      <w:r>
+        <w:t xml:space="preserve"> </w:t>
+      </w:r>
+      <w:r>
+        <w:rPr>
+          <w:i/>
+          <w:iCs/>
+        </w:rPr>
+        <w:t xml:space="preserve">or</w:t>
+      </w:r>
+      <w:r>
+        <w:t xml:space="preserve"> </w:t>
+      </w:r>
+      <w:r>
+        <w:t xml:space="preserve">a core SBML constraint, not both.)</w:t>
       </w:r>
     </w:p>
     <w:p>
@@ -14621,6 +14749,139 @@
         <w:pStyle w:val="BodyText"/>
       </w:pPr>
       <w:r>
+        <w:t xml:space="preserve">As of Antimony v3.1, these flux balance constraints are translated to</w:t>
+      </w:r>
+      <w:r>
+        <w:t xml:space="preserve"> </w:t>
+      </w:r>
+      <w:r>
+        <w:t xml:space="preserve">the SBML FBC package version 3, instead of version 1. Because all</w:t>
+      </w:r>
+      <w:r>
+        <w:t xml:space="preserve"> </w:t>
+      </w:r>
+      <w:r>
+        <w:t xml:space="preserve">FBC v3 constraints are stored as parameters, a translation of FBC</w:t>
+      </w:r>
+      <w:r>
+        <w:t xml:space="preserve"> </w:t>
+      </w:r>
+      <w:r>
+        <w:t xml:space="preserve">constraints to Antimony will result in constaints like the following:</w:t>
+      </w:r>
+    </w:p>
+    <w:p>
+      <w:pPr>
+        <w:pStyle w:val="SourceCode"/>
+      </w:pPr>
+      <w:r>
+        <w:rPr>
+          <w:rStyle w:val="VerbatimChar"/>
+        </w:rPr>
+        <w:t xml:space="preserve">constraint J001_fluxBounds: FB2N0 &lt;= J001 &lt;= FB3N1</w:t>
+      </w:r>
+      <w:r>
+        <w:br/>
+      </w:r>
+      <w:r>
+        <w:rPr>
+          <w:rStyle w:val="VerbatimChar"/>
+        </w:rPr>
+        <w:t xml:space="preserve">constraint J002_fluxBounds: FB2N0 &lt;= J002 &lt;= FB3N1</w:t>
+      </w:r>
+      <w:r>
+        <w:br/>
+      </w:r>
+      <w:r>
+        <w:br/>
+      </w:r>
+      <w:r>
+        <w:rPr>
+          <w:rStyle w:val="VerbatimChar"/>
+        </w:rPr>
+        <w:t xml:space="preserve">FB2N0 = 0;</w:t>
+      </w:r>
+      <w:r>
+        <w:br/>
+      </w:r>
+      <w:r>
+        <w:rPr>
+          <w:rStyle w:val="VerbatimChar"/>
+        </w:rPr>
+        <w:t xml:space="preserve">FB3N1 = 1;</w:t>
+      </w:r>
+    </w:p>
+    <w:p>
+      <w:pPr>
+        <w:pStyle w:val="FirstParagraph"/>
+      </w:pPr>
+      <w:r>
+        <w:t xml:space="preserve">Also note that since FBC v2 and v3 dropped</w:t>
+      </w:r>
+      <w:r>
+        <w:t xml:space="preserve"> </w:t>
+      </w:r>
+      <w:r>
+        <w:t xml:space="preserve">‘&lt;’</w:t>
+      </w:r>
+      <w:r>
+        <w:t xml:space="preserve"> </w:t>
+      </w:r>
+      <w:r>
+        <w:t xml:space="preserve">in favor of</w:t>
+      </w:r>
+      <w:r>
+        <w:t xml:space="preserve"> </w:t>
+      </w:r>
+      <w:r>
+        <w:t xml:space="preserve">‘&lt;=’</w:t>
+      </w:r>
+      <w:r>
+        <w:t xml:space="preserve">,</w:t>
+      </w:r>
+      <w:r>
+        <w:t xml:space="preserve"> </w:t>
+      </w:r>
+      <w:r>
+        <w:t xml:space="preserve">all FBC constraints will be converted to</w:t>
+      </w:r>
+      <w:r>
+        <w:t xml:space="preserve"> </w:t>
+      </w:r>
+      <w:r>
+        <w:t xml:space="preserve">‘&lt;=’</w:t>
+      </w:r>
+      <w:r>
+        <w:t xml:space="preserve"> </w:t>
+      </w:r>
+      <w:r>
+        <w:t xml:space="preserve">and</w:t>
+      </w:r>
+      <w:r>
+        <w:t xml:space="preserve"> </w:t>
+      </w:r>
+      <w:r>
+        <w:t xml:space="preserve">‘&gt;=’</w:t>
+      </w:r>
+      <w:r>
+        <w:t xml:space="preserve">.</w:t>
+      </w:r>
+    </w:p>
+    <w:bookmarkEnd w:id="72"/>
+    <w:bookmarkStart w:id="73" w:name="objectives"/>
+    <w:p>
+      <w:pPr>
+        <w:pStyle w:val="Heading4"/>
+      </w:pPr>
+      <w:r>
+        <w:t xml:space="preserve">Objectives</w:t>
+      </w:r>
+    </w:p>
+    <w:p>
+      <w:pPr>
+        <w:pStyle w:val="FirstParagraph"/>
+      </w:pPr>
+      <w:r>
         <w:t xml:space="preserve">The objective function is defined using either the keyword</w:t>
       </w:r>
       <w:r>
@@ -14677,8 +14938,419 @@
         <w:t xml:space="preserve">obj1: minimize J2</w:t>
       </w:r>
     </w:p>
-    <w:bookmarkEnd w:id="72"/>
-    <w:bookmarkStart w:id="73" w:name="other-files"/>
+    <w:p>
+      <w:pPr>
+        <w:pStyle w:val="FirstParagraph"/>
+      </w:pPr>
+      <w:r>
+        <w:t xml:space="preserve">Objectives may be fairly complicated, but must be strict additive</w:t>
+      </w:r>
+      <w:r>
+        <w:t xml:space="preserve"> </w:t>
+      </w:r>
+      <w:r>
+        <w:t xml:space="preserve">combinations of multiples of reaction rates, with those reaction rates</w:t>
+      </w:r>
+      <w:r>
+        <w:t xml:space="preserve"> </w:t>
+      </w:r>
+      <w:r>
+        <w:t xml:space="preserve">optionally being squared or multiplied by other reaction rates:</w:t>
+      </w:r>
+    </w:p>
+    <w:p>
+      <w:pPr>
+        <w:pStyle w:val="SourceCode"/>
+      </w:pPr>
+      <w:r>
+        <w:rPr>
+          <w:rStyle w:val="VerbatimChar"/>
+        </w:rPr>
+        <w:t xml:space="preserve">obj3: maximize J1 + 3*J2 + 4*J3^2 + 5*J4*J5</w:t>
+      </w:r>
+    </w:p>
+    <w:bookmarkEnd w:id="73"/>
+    <w:bookmarkStart w:id="74" w:name="X03dbc526dc4cea15bbccfad422f3dd4caeddfd8"/>
+    <w:p>
+      <w:pPr>
+        <w:pStyle w:val="Heading4"/>
+      </w:pPr>
+      <w:r>
+        <w:t xml:space="preserve">Gene Products and Gene Product Associations</w:t>
+      </w:r>
+    </w:p>
+    <w:p>
+      <w:pPr>
+        <w:pStyle w:val="FirstParagraph"/>
+      </w:pPr>
+      <w:r>
+        <w:t xml:space="preserve">The SBML FBC package also allows the definition of gene products,</w:t>
+      </w:r>
+      <w:r>
+        <w:t xml:space="preserve"> </w:t>
+      </w:r>
+      <w:r>
+        <w:t xml:space="preserve">which may optionally reference a species, and gene product associations,</w:t>
+      </w:r>
+      <w:r>
+        <w:t xml:space="preserve"> </w:t>
+      </w:r>
+      <w:r>
+        <w:t xml:space="preserve">which are additional information about reactions. A gene product</w:t>
+      </w:r>
+      <w:r>
+        <w:t xml:space="preserve"> </w:t>
+      </w:r>
+      <w:r>
+        <w:t xml:space="preserve">association may be defined by appending</w:t>
+      </w:r>
+      <w:r>
+        <w:t xml:space="preserve"> </w:t>
+      </w:r>
+      <w:r>
+        <w:t xml:space="preserve">‘.geneProductAssociation’</w:t>
+      </w:r>
+      <w:r>
+        <w:t xml:space="preserve"> </w:t>
+      </w:r>
+      <w:r>
+        <w:t xml:space="preserve">or</w:t>
+      </w:r>
+      <w:r>
+        <w:t xml:space="preserve"> </w:t>
+      </w:r>
+      <w:r>
+        <w:t xml:space="preserve">‘.gpa’</w:t>
+      </w:r>
+      <w:r>
+        <w:t xml:space="preserve"> </w:t>
+      </w:r>
+      <w:r>
+        <w:t xml:space="preserve">to a reaction ID, and defined by combining any number of gene</w:t>
+      </w:r>
+      <w:r>
+        <w:t xml:space="preserve"> </w:t>
+      </w:r>
+      <w:r>
+        <w:t xml:space="preserve">product IDs in</w:t>
+      </w:r>
+      <w:r>
+        <w:t xml:space="preserve"> </w:t>
+      </w:r>
+      <w:r>
+        <w:t xml:space="preserve">‘and’</w:t>
+      </w:r>
+      <w:r>
+        <w:t xml:space="preserve"> </w:t>
+      </w:r>
+      <w:r>
+        <w:t xml:space="preserve">and</w:t>
+      </w:r>
+      <w:r>
+        <w:t xml:space="preserve"> </w:t>
+      </w:r>
+      <w:r>
+        <w:t xml:space="preserve">‘or’</w:t>
+      </w:r>
+      <w:r>
+        <w:t xml:space="preserve"> </w:t>
+      </w:r>
+      <w:r>
+        <w:t xml:space="preserve">combinations:</w:t>
+      </w:r>
+    </w:p>
+    <w:p>
+      <w:pPr>
+        <w:pStyle w:val="SourceCode"/>
+      </w:pPr>
+      <w:r>
+        <w:rPr>
+          <w:rStyle w:val="VerbatimChar"/>
+        </w:rPr>
+        <w:t xml:space="preserve">J0.geneProductAssociation = G_kasB</w:t>
+      </w:r>
+      <w:r>
+        <w:br/>
+      </w:r>
+      <w:r>
+        <w:rPr>
+          <w:rStyle w:val="VerbatimChar"/>
+        </w:rPr>
+        <w:t xml:space="preserve">J1.gpa                    = G_kasB &amp;&amp; G_kasA;</w:t>
+      </w:r>
+      <w:r>
+        <w:br/>
+      </w:r>
+      <w:r>
+        <w:rPr>
+          <w:rStyle w:val="VerbatimChar"/>
+        </w:rPr>
+        <w:t xml:space="preserve">J2.gpa                    = (G_kasB &amp;&amp; G_kasA) || G_kasC</w:t>
+      </w:r>
+    </w:p>
+    <w:p>
+      <w:pPr>
+        <w:pStyle w:val="FirstParagraph"/>
+      </w:pPr>
+      <w:r>
+        <w:t xml:space="preserve">Any ID used in a gene product association will be automatically</w:t>
+      </w:r>
+      <w:r>
+        <w:t xml:space="preserve"> </w:t>
+      </w:r>
+      <w:r>
+        <w:t xml:space="preserve">defined as a gene product, but you may also define them explicitly:</w:t>
+      </w:r>
+    </w:p>
+    <w:p>
+      <w:pPr>
+        <w:pStyle w:val="SourceCode"/>
+      </w:pPr>
+      <w:r>
+        <w:rPr>
+          <w:rStyle w:val="VerbatimChar"/>
+        </w:rPr>
+        <w:t xml:space="preserve">geneProduct G_kasA, G_kasB, G_kasC</w:t>
+      </w:r>
+    </w:p>
+    <w:p>
+      <w:pPr>
+        <w:pStyle w:val="FirstParagraph"/>
+      </w:pPr>
+      <w:r>
+        <w:t xml:space="preserve">Commonly-used gene product names sometimes to not conform to the</w:t>
+      </w:r>
+      <w:r>
+        <w:t xml:space="preserve"> </w:t>
+      </w:r>
+      <w:r>
+        <w:t xml:space="preserve">Antimony or SBML-style syntax for IDs. As a result, the FBC package</w:t>
+      </w:r>
+      <w:r>
+        <w:t xml:space="preserve"> </w:t>
+      </w:r>
+      <w:r>
+        <w:t xml:space="preserve">adds a</w:t>
+      </w:r>
+      <w:r>
+        <w:t xml:space="preserve"> </w:t>
+      </w:r>
+      <w:r>
+        <w:t xml:space="preserve">‘label’</w:t>
+      </w:r>
+      <w:r>
+        <w:t xml:space="preserve"> </w:t>
+      </w:r>
+      <w:r>
+        <w:t xml:space="preserve">to gene products which may be any syntax. In Antimony,</w:t>
+      </w:r>
+      <w:r>
+        <w:t xml:space="preserve"> </w:t>
+      </w:r>
+      <w:r>
+        <w:t xml:space="preserve">the</w:t>
+      </w:r>
+      <w:r>
+        <w:t xml:space="preserve"> </w:t>
+      </w:r>
+      <w:r>
+        <w:t xml:space="preserve">‘display name’</w:t>
+      </w:r>
+      <w:r>
+        <w:t xml:space="preserve"> </w:t>
+      </w:r>
+      <w:r>
+        <w:t xml:space="preserve">is used for this purpose:</w:t>
+      </w:r>
+    </w:p>
+    <w:p>
+      <w:pPr>
+        <w:pStyle w:val="SourceCode"/>
+      </w:pPr>
+      <w:r>
+        <w:rPr>
+          <w:rStyle w:val="VerbatimChar"/>
+        </w:rPr>
+        <w:t xml:space="preserve">G_kasA is "Gene-kasA"</w:t>
+      </w:r>
+    </w:p>
+    <w:p>
+      <w:pPr>
+        <w:pStyle w:val="FirstParagraph"/>
+      </w:pPr>
+      <w:r>
+        <w:t xml:space="preserve">To declare an</w:t>
+      </w:r>
+      <w:r>
+        <w:t xml:space="preserve"> </w:t>
+      </w:r>
+      <w:r>
+        <w:t xml:space="preserve">‘associated species’</w:t>
+      </w:r>
+      <w:r>
+        <w:t xml:space="preserve"> </w:t>
+      </w:r>
+      <w:r>
+        <w:t xml:space="preserve">for a gene product, simply use</w:t>
+      </w:r>
+      <w:r>
+        <w:t xml:space="preserve"> </w:t>
+      </w:r>
+      <w:r>
+        <w:t xml:space="preserve">‘=’</w:t>
+      </w:r>
+      <w:r>
+        <w:t xml:space="preserve">:</w:t>
+      </w:r>
+    </w:p>
+    <w:p>
+      <w:pPr>
+        <w:pStyle w:val="SourceCode"/>
+      </w:pPr>
+      <w:r>
+        <w:rPr>
+          <w:rStyle w:val="VerbatimChar"/>
+        </w:rPr>
+        <w:t xml:space="preserve">G_kasA = S1</w:t>
+      </w:r>
+    </w:p>
+    <w:bookmarkEnd w:id="74"/>
+    <w:bookmarkStart w:id="75" w:name="species-charge-and-chemical-formula"/>
+    <w:p>
+      <w:pPr>
+        <w:pStyle w:val="Heading4"/>
+      </w:pPr>
+      <w:r>
+        <w:t xml:space="preserve">Species charge and chemical formula</w:t>
+      </w:r>
+    </w:p>
+    <w:p>
+      <w:pPr>
+        <w:pStyle w:val="FirstParagraph"/>
+      </w:pPr>
+      <w:r>
+        <w:t xml:space="preserve">The SBML FBC package additionally allows the charge and chemical</w:t>
+      </w:r>
+      <w:r>
+        <w:t xml:space="preserve"> </w:t>
+      </w:r>
+      <w:r>
+        <w:t xml:space="preserve">formulas of species to be stored. The charge must be a number, and</w:t>
+      </w:r>
+      <w:r>
+        <w:t xml:space="preserve"> </w:t>
+      </w:r>
+      <w:r>
+        <w:t xml:space="preserve">the chemical formula must conform to the syntax defined in the FBC</w:t>
+      </w:r>
+      <w:r>
+        <w:t xml:space="preserve"> </w:t>
+      </w:r>
+      <w:r>
+        <w:t xml:space="preserve">specification, with (essentially) numbers and atom names, in alphabetical</w:t>
+      </w:r>
+      <w:r>
+        <w:t xml:space="preserve"> </w:t>
+      </w:r>
+      <w:r>
+        <w:t xml:space="preserve">order after carbon, though some variation is allowed. The charge is</w:t>
+      </w:r>
+      <w:r>
+        <w:t xml:space="preserve"> </w:t>
+      </w:r>
+      <w:r>
+        <w:t xml:space="preserve">defined with</w:t>
+      </w:r>
+      <w:r>
+        <w:t xml:space="preserve"> </w:t>
+      </w:r>
+      <w:r>
+        <w:t xml:space="preserve">‘[speciesID].charge’</w:t>
+      </w:r>
+      <w:r>
+        <w:t xml:space="preserve">, and the chemical formula may be</w:t>
+      </w:r>
+      <w:r>
+        <w:t xml:space="preserve"> </w:t>
+      </w:r>
+      <w:r>
+        <w:t xml:space="preserve">defined with</w:t>
+      </w:r>
+      <w:r>
+        <w:t xml:space="preserve"> </w:t>
+      </w:r>
+      <w:r>
+        <w:t xml:space="preserve">‘[id].formula’</w:t>
+      </w:r>
+      <w:r>
+        <w:t xml:space="preserve"> </w:t>
+      </w:r>
+      <w:r>
+        <w:t xml:space="preserve">or</w:t>
+      </w:r>
+      <w:r>
+        <w:t xml:space="preserve"> </w:t>
+      </w:r>
+      <w:r>
+        <w:t xml:space="preserve">‘[id].chemicalFormula’</w:t>
+      </w:r>
+      <w:r>
+        <w:t xml:space="preserve">. Alternatively,</w:t>
+      </w:r>
+      <w:r>
+        <w:t xml:space="preserve"> </w:t>
+      </w:r>
+      <w:r>
+        <w:t xml:space="preserve">‘is’</w:t>
+      </w:r>
+      <w:r>
+        <w:t xml:space="preserve"> </w:t>
+      </w:r>
+      <w:r>
+        <w:t xml:space="preserve">may be used, but either way, the formula must be in quotes:</w:t>
+      </w:r>
+    </w:p>
+    <w:p>
+      <w:pPr>
+        <w:pStyle w:val="SourceCode"/>
+      </w:pPr>
+      <w:r>
+        <w:rPr>
+          <w:rStyle w:val="VerbatimChar"/>
+        </w:rPr>
+        <w:t xml:space="preserve">S1.charge = 3.2</w:t>
+      </w:r>
+      <w:r>
+        <w:br/>
+      </w:r>
+      <w:r>
+        <w:rPr>
+          <w:rStyle w:val="VerbatimChar"/>
+        </w:rPr>
+        <w:t xml:space="preserve">S2.chemicalFormula = "C10H12N5O13P3"</w:t>
+      </w:r>
+      <w:r>
+        <w:br/>
+      </w:r>
+      <w:r>
+        <w:rPr>
+          <w:rStyle w:val="VerbatimChar"/>
+        </w:rPr>
+        <w:t xml:space="preserve">S3.formula = "C2H4O2(CH2)n"</w:t>
+      </w:r>
+      <w:r>
+        <w:br/>
+      </w:r>
+      <w:r>
+        <w:rPr>
+          <w:rStyle w:val="VerbatimChar"/>
+        </w:rPr>
+        <w:t xml:space="preserve">S4.formula is "CH2NO"</w:t>
+      </w:r>
+    </w:p>
+    <w:bookmarkEnd w:id="75"/>
+    <w:bookmarkEnd w:id="76"/>
+    <w:bookmarkStart w:id="77" w:name="other-files"/>
     <w:p>
       <w:pPr>
         <w:pStyle w:val="Heading3"/>
@@ -15220,8 +15892,8 @@
         <w:t xml:space="preserve">directive, between the quotation marks.</w:t>
       </w:r>
     </w:p>
-    <w:bookmarkEnd w:id="73"/>
-    <w:bookmarkStart w:id="75" w:name="importing-and-exporting-antimony-models"/>
+    <w:bookmarkEnd w:id="77"/>
+    <w:bookmarkStart w:id="79" w:name="importing-and-exporting-antimony-models"/>
     <w:p>
       <w:pPr>
         <w:pStyle w:val="Heading3"/>
@@ -15276,7 +15948,7 @@
       <w:r>
         <w:t xml:space="preserve"> </w:t>
       </w:r>
-      <w:hyperlink r:id="rId74">
+      <w:hyperlink r:id="rId78">
         <w:r>
           <w:rPr>
             <w:rStyle w:val="Hyperlink"/>
@@ -15731,9 +16403,9 @@
         <w:t xml:space="preserve">package.</w:t>
       </w:r>
     </w:p>
-    <w:bookmarkEnd w:id="75"/>
-    <w:bookmarkEnd w:id="76"/>
-    <w:bookmarkStart w:id="85" w:name="layout-and-render"/>
+    <w:bookmarkEnd w:id="79"/>
+    <w:bookmarkEnd w:id="80"/>
+    <w:bookmarkStart w:id="89" w:name="layout-and-render"/>
     <w:p>
       <w:pPr>
         <w:pStyle w:val="Heading2"/>
@@ -15798,7 +16470,7 @@
         <w:t xml:space="preserve">package defines the style of the display: the lines, colors, fonts, etc. Antimony allows the modeler to define whatever they like, and uses the autorender and autolayout functions of SBMLNetwork to define the rest. It is also possible to import an SBML model with Layout and/or Render information to Antimony for inspection or modification.</w:t>
       </w:r>
     </w:p>
-    <w:bookmarkStart w:id="77" w:name="basic-layout-information"/>
+    <w:bookmarkStart w:id="81" w:name="basic-layout-information"/>
     <w:p>
       <w:pPr>
         <w:pStyle w:val="Heading3"/>
@@ -15873,8 +16545,8 @@
         <w:t xml:space="preserve">The default value is 3.</w:t>
       </w:r>
     </w:p>
-    <w:bookmarkEnd w:id="77"/>
-    <w:bookmarkStart w:id="78" w:name="positioning-model-elements"/>
+    <w:bookmarkEnd w:id="81"/>
+    <w:bookmarkStart w:id="82" w:name="positioning-model-elements"/>
     <w:p>
       <w:pPr>
         <w:pStyle w:val="Heading3"/>
@@ -15981,8 +16653,8 @@
         <w:t xml:space="preserve">Only species, reactions, and compartments can be given a position; all other elements (such as parameters or events) do not appear.</w:t>
       </w:r>
     </w:p>
-    <w:bookmarkEnd w:id="78"/>
-    <w:bookmarkStart w:id="79" w:name="sizing-model-elements"/>
+    <w:bookmarkEnd w:id="82"/>
+    <w:bookmarkStart w:id="83" w:name="sizing-model-elements"/>
     <w:p>
       <w:pPr>
         <w:pStyle w:val="Heading3"/>
@@ -16141,8 +16813,8 @@
         <w:t xml:space="preserve">means that species S1 will have twice the width and height of all other species in the display.</w:t>
       </w:r>
     </w:p>
-    <w:bookmarkEnd w:id="79"/>
-    <w:bookmarkStart w:id="80" w:name="reaction-arcs"/>
+    <w:bookmarkEnd w:id="83"/>
+    <w:bookmarkStart w:id="84" w:name="reaction-arcs"/>
     <w:p>
       <w:pPr>
         <w:pStyle w:val="Heading3"/>
@@ -16937,8 +17609,8 @@
         <w:t xml:space="preserve">J0.S1.arc2.seg3.species_end = {740, 992}</w:t>
       </w:r>
     </w:p>
-    <w:bookmarkEnd w:id="80"/>
-    <w:bookmarkStart w:id="81" w:name="reaction-source-or-sinks"/>
+    <w:bookmarkEnd w:id="84"/>
+    <w:bookmarkStart w:id="85" w:name="reaction-source-or-sinks"/>
     <w:p>
       <w:pPr>
         <w:pStyle w:val="Heading3"/>
@@ -17033,8 +17705,8 @@
         <w:t xml:space="preserve">   J0.--.b2 = {311.8, 369.76}</w:t>
       </w:r>
     </w:p>
-    <w:bookmarkEnd w:id="81"/>
-    <w:bookmarkStart w:id="82" w:name="species-alias-nodes"/>
+    <w:bookmarkEnd w:id="85"/>
+    <w:bookmarkStart w:id="86" w:name="species-alias-nodes"/>
     <w:p>
       <w:pPr>
         <w:pStyle w:val="Heading3"/>
@@ -17071,8 +17743,8 @@
         <w:t xml:space="preserve">   S1.size.J3.J4 = {80, 50}</w:t>
       </w:r>
     </w:p>
-    <w:bookmarkEnd w:id="82"/>
-    <w:bookmarkStart w:id="83" w:name="general-styles"/>
+    <w:bookmarkEnd w:id="86"/>
+    <w:bookmarkStart w:id="87" w:name="general-styles"/>
     <w:p>
       <w:pPr>
         <w:pStyle w:val="Heading3"/>
@@ -17116,8 +17788,8 @@
         <w:t xml:space="preserve">default, blue ombre, green ombre, gray ombre, red ombre, orange ombre, brown ombre, purple ombre, purple ombre 2, black and white, orange and blue, purple and yellow, green and red, power, calm, sunset, electric, midnight, vibrance, ocean, forest, warm tone, cool tone, and escher</w:t>
       </w:r>
     </w:p>
-    <w:bookmarkEnd w:id="83"/>
-    <w:bookmarkStart w:id="84" w:name="style-settings"/>
+    <w:bookmarkEnd w:id="87"/>
+    <w:bookmarkStart w:id="88" w:name="style-settings"/>
     <w:p>
       <w:pPr>
         <w:pStyle w:val="Heading3"/>
@@ -17598,9 +18270,9 @@
         <w:t xml:space="preserve">of a reaction refers to the shape at the centroid of the arc between the reactants and the products. By default, this is a square of size {20, 20}.</w:t>
       </w:r>
     </w:p>
-    <w:bookmarkEnd w:id="84"/>
-    <w:bookmarkEnd w:id="85"/>
-    <w:bookmarkStart w:id="86" w:name="Xccd004f780dfc5c78c7be0d66e6d54c5c625bb3"/>
+    <w:bookmarkEnd w:id="88"/>
+    <w:bookmarkEnd w:id="89"/>
+    <w:bookmarkStart w:id="90" w:name="Xccd004f780dfc5c78c7be0d66e6d54c5c625bb3"/>
     <w:p>
       <w:pPr>
         <w:pStyle w:val="Heading2"/>
@@ -18235,8 +18907,8 @@
         <w:t xml:space="preserve">, etc.</w:t>
       </w:r>
     </w:p>
-    <w:bookmarkEnd w:id="86"/>
-    <w:bookmarkStart w:id="90" w:name="further-reading"/>
+    <w:bookmarkEnd w:id="90"/>
+    <w:bookmarkStart w:id="94" w:name="further-reading"/>
     <w:p>
       <w:pPr>
         <w:pStyle w:val="Heading2"/>
@@ -18259,7 +18931,7 @@
       <w:r>
         <w:t xml:space="preserve"> </w:t>
       </w:r>
-      <w:hyperlink r:id="rId87">
+      <w:hyperlink r:id="rId91">
         <w:r>
           <w:rPr>
             <w:rStyle w:val="Hyperlink"/>
@@ -18294,7 +18966,7 @@
       <w:r>
         <w:t xml:space="preserve"> </w:t>
       </w:r>
-      <w:hyperlink r:id="rId88">
+      <w:hyperlink r:id="rId92">
         <w:r>
           <w:rPr>
             <w:rStyle w:val="Hyperlink"/>
@@ -18326,7 +18998,7 @@
           <w:numId w:val="1016"/>
         </w:numPr>
       </w:pPr>
-      <w:hyperlink r:id="rId89">
+      <w:hyperlink r:id="rId93">
         <w:r>
           <w:rPr>
             <w:rStyle w:val="Hyperlink"/>
@@ -18347,8 +19019,8 @@
         <w:t xml:space="preserve">PDF format.</w:t>
       </w:r>
     </w:p>
-    <w:bookmarkEnd w:id="90"/>
-    <w:bookmarkEnd w:id="91"/>
+    <w:bookmarkEnd w:id="94"/>
+    <w:bookmarkEnd w:id="95"/>
     <w:sectPr>
       <w:footnotePr>
         <w:numRestart w:val="eachSect"/>

</xml_diff>

<commit_message>
Update docs with full layout example.
</commit_message>
<xml_diff>
--- a/doc/AntimonyTutorial.docx
+++ b/doc/AntimonyTutorial.docx
@@ -2,7 +2,7 @@
 <file path=word/document.xml><?xml version="1.0" encoding="utf-8"?>
 <w:document xmlns:w="http://schemas.openxmlformats.org/wordprocessingml/2006/main" xmlns:m="http://schemas.openxmlformats.org/officeDocument/2006/math" xmlns:r="http://schemas.openxmlformats.org/officeDocument/2006/relationships" xmlns:o="urn:schemas-microsoft-com:office:office" xmlns:v="urn:schemas-microsoft-com:vml" xmlns:w10="urn:schemas-microsoft-com:office:word" xmlns:a="http://schemas.openxmlformats.org/drawingml/2006/main" xmlns:pic="http://schemas.openxmlformats.org/drawingml/2006/picture" xmlns:wp="http://schemas.openxmlformats.org/drawingml/2006/wordprocessingDrawing">
   <w:body>
-    <w:bookmarkStart w:id="95" w:name="antimony-reference"/>
+    <w:bookmarkStart w:id="96" w:name="antimony-reference"/>
     <w:p>
       <w:pPr>
         <w:pStyle w:val="Heading1"/>
@@ -16405,7 +16405,7 @@
     </w:p>
     <w:bookmarkEnd w:id="79"/>
     <w:bookmarkEnd w:id="80"/>
-    <w:bookmarkStart w:id="89" w:name="layout-and-render"/>
+    <w:bookmarkStart w:id="90" w:name="layout-and-render"/>
     <w:p>
       <w:pPr>
         <w:pStyle w:val="Heading2"/>
@@ -18271,8 +18271,589 @@
       </w:r>
     </w:p>
     <w:bookmarkEnd w:id="88"/>
+    <w:bookmarkStart w:id="89" w:name="a-full-example"/>
+    <w:p>
+      <w:pPr>
+        <w:pStyle w:val="Heading3"/>
+      </w:pPr>
+      <w:r>
+        <w:t xml:space="preserve">A full example</w:t>
+      </w:r>
+    </w:p>
+    <w:p>
+      <w:pPr>
+        <w:pStyle w:val="FirstParagraph"/>
+      </w:pPr>
+      <w:r>
+        <w:t xml:space="preserve">Here’s a fairly complete model that exercises most of the elements of a typical Antimony layout:</w:t>
+      </w:r>
+    </w:p>
+    <w:p>
+      <w:pPr>
+        <w:pStyle w:val="SourceCode"/>
+      </w:pPr>
+      <w:r>
+        <w:rPr>
+          <w:rStyle w:val="VerbatimChar"/>
+        </w:rPr>
+        <w:t xml:space="preserve">    J0: S1-&gt;S2;</w:t>
+      </w:r>
+      <w:r>
+        <w:br/>
+      </w:r>
+      <w:r>
+        <w:rPr>
+          <w:rStyle w:val="VerbatimChar"/>
+        </w:rPr>
+        <w:t xml:space="preserve">    # If you just want layout on:</w:t>
+      </w:r>
+      <w:r>
+        <w:br/>
+      </w:r>
+      <w:r>
+        <w:rPr>
+          <w:rStyle w:val="VerbatimChar"/>
+        </w:rPr>
+        <w:t xml:space="preserve">    model.layout = on                   # Only need to turn on if don't define anything else; doesn't work to turn it off.</w:t>
+      </w:r>
+      <w:r>
+        <w:br/>
+      </w:r>
+      <w:r>
+        <w:br/>
+      </w:r>
+      <w:r>
+        <w:rPr>
+          <w:rStyle w:val="VerbatimChar"/>
+        </w:rPr>
+        <w:t xml:space="preserve">    //Autolayout options:</w:t>
+      </w:r>
+      <w:r>
+        <w:br/>
+      </w:r>
+      <w:r>
+        <w:rPr>
+          <w:rStyle w:val="VerbatimChar"/>
+        </w:rPr>
+        <w:t xml:space="preserve">    model.autolayout.maxNumConnectedEdges = 5  # If a single species is involved in more than this number of reactions, it gets aliased.  Default 3.</w:t>
+      </w:r>
+      <w:r>
+        <w:br/>
+      </w:r>
+      <w:r>
+        <w:br/>
+      </w:r>
+      <w:r>
+        <w:rPr>
+          <w:rStyle w:val="VerbatimChar"/>
+        </w:rPr>
+        <w:t xml:space="preserve">    # General layout defaults:</w:t>
+      </w:r>
+      <w:r>
+        <w:br/>
+      </w:r>
+      <w:r>
+        <w:rPr>
+          <w:rStyle w:val="VerbatimChar"/>
+        </w:rPr>
+        <w:t xml:space="preserve">    model.layout.style = calm           # Set the overall style to one of Adel's predefined styles.</w:t>
+      </w:r>
+      <w:r>
+        <w:br/>
+      </w:r>
+      <w:r>
+        <w:rPr>
+          <w:rStyle w:val="VerbatimChar"/>
+        </w:rPr>
+        <w:t xml:space="preserve">    model.layout.align_top = {S1}       # Align these nodes in the same row at the top of the layout.  </w:t>
+      </w:r>
+      <w:r>
+        <w:br/>
+      </w:r>
+      <w:r>
+        <w:rPr>
+          <w:rStyle w:val="VerbatimChar"/>
+        </w:rPr>
+        <w:t xml:space="preserve">                                        # (Also available: align_ - bottom, right, left, hCenter, vCenter, and circular)</w:t>
+      </w:r>
+      <w:r>
+        <w:br/>
+      </w:r>
+      <w:r>
+        <w:rPr>
+          <w:rStyle w:val="VerbatimChar"/>
+        </w:rPr>
+        <w:t xml:space="preserve">    model.layout.size = {505, 404}      # {width, height}  The size of the entire layout. </w:t>
+      </w:r>
+      <w:r>
+        <w:br/>
+      </w:r>
+      <w:r>
+        <w:rPr>
+          <w:rStyle w:val="VerbatimChar"/>
+        </w:rPr>
+        <w:t xml:space="preserve">    model.layout.width = 505            # alt for 'size'   The width of the entire layout.</w:t>
+      </w:r>
+      <w:r>
+        <w:br/>
+      </w:r>
+      <w:r>
+        <w:rPr>
+          <w:rStyle w:val="VerbatimChar"/>
+        </w:rPr>
+        <w:t xml:space="preserve">    model.layout.height = 404           # alt for 'size'   The height of the entire layout.</w:t>
+      </w:r>
+      <w:r>
+        <w:br/>
+      </w:r>
+      <w:r>
+        <w:br/>
+      </w:r>
+      <w:r>
+        <w:rPr>
+          <w:rStyle w:val="VerbatimChar"/>
+        </w:rPr>
+        <w:t xml:space="preserve">    model.layout.background = fuchsia   # The background color</w:t>
+      </w:r>
+      <w:r>
+        <w:br/>
+      </w:r>
+      <w:r>
+        <w:rPr>
+          <w:rStyle w:val="VerbatimChar"/>
+        </w:rPr>
+        <w:t xml:space="preserve">    model.layout.color = khaki          # (or 'fillcolor')  The fill color for all elements in the layout</w:t>
+      </w:r>
+      <w:r>
+        <w:br/>
+      </w:r>
+      <w:r>
+        <w:rPr>
+          <w:rStyle w:val="VerbatimChar"/>
+        </w:rPr>
+        <w:t xml:space="preserve">    model.layout.linecolor = azure      # (or 'strokecolor')  The default line color for all elements in the layout</w:t>
+      </w:r>
+      <w:r>
+        <w:br/>
+      </w:r>
+      <w:r>
+        <w:rPr>
+          <w:rStyle w:val="VerbatimChar"/>
+        </w:rPr>
+        <w:t xml:space="preserve">    model.layout.linewidth = 32         # (or 'strokewidth')  The default linewidth for all elements in the layout</w:t>
+      </w:r>
+      <w:r>
+        <w:br/>
+      </w:r>
+      <w:r>
+        <w:rPr>
+          <w:rStyle w:val="VerbatimChar"/>
+        </w:rPr>
+        <w:t xml:space="preserve">    model.layout.fontcolor = coral      # The default font color for all text in the layout</w:t>
+      </w:r>
+      <w:r>
+        <w:br/>
+      </w:r>
+      <w:r>
+        <w:rPr>
+          <w:rStyle w:val="VerbatimChar"/>
+        </w:rPr>
+        <w:t xml:space="preserve">    model.layout.font = monospace       # The default font for all text in the layout (predefined options are 'serif' (default), 'sans_serif', and 'monospace', but arbitrary font names are also legal.)</w:t>
+      </w:r>
+      <w:r>
+        <w:br/>
+      </w:r>
+      <w:r>
+        <w:rPr>
+          <w:rStyle w:val="VerbatimChar"/>
+        </w:rPr>
+        <w:t xml:space="preserve">    model.layout.fontsize = 4           # The default font size for all text in the layout (default 10)</w:t>
+      </w:r>
+      <w:r>
+        <w:br/>
+      </w:r>
+      <w:r>
+        <w:rPr>
+          <w:rStyle w:val="VerbatimChar"/>
+        </w:rPr>
+        <w:t xml:space="preserve">    model.layout.fontstyle = italic     # (or 'fontweight')  The default font style for all text in the layout (options are 'normal' (default), 'bold', 'italic', and 'bold_italic').</w:t>
+      </w:r>
+      <w:r>
+        <w:br/>
+      </w:r>
+      <w:r>
+        <w:br/>
+      </w:r>
+      <w:r>
+        <w:rPr>
+          <w:rStyle w:val="VerbatimChar"/>
+        </w:rPr>
+        <w:t xml:space="preserve">    # Group type defaults (species, compartments, reactions)</w:t>
+      </w:r>
+      <w:r>
+        <w:br/>
+      </w:r>
+      <w:r>
+        <w:rPr>
+          <w:rStyle w:val="VerbatimChar"/>
+        </w:rPr>
+        <w:t xml:space="preserve">    species.size = {68, 101}            # The default size (width, height) for all species in the layout</w:t>
+      </w:r>
+      <w:r>
+        <w:br/>
+      </w:r>
+      <w:r>
+        <w:rPr>
+          <w:rStyle w:val="VerbatimChar"/>
+        </w:rPr>
+        <w:t xml:space="preserve">    species.width = 68                  # The default height for all species in the layout</w:t>
+      </w:r>
+      <w:r>
+        <w:br/>
+      </w:r>
+      <w:r>
+        <w:rPr>
+          <w:rStyle w:val="VerbatimChar"/>
+        </w:rPr>
+        <w:t xml:space="preserve">    species.height = 101                # The default height for all species in the layout</w:t>
+      </w:r>
+      <w:r>
+        <w:br/>
+      </w:r>
+      <w:r>
+        <w:rPr>
+          <w:rStyle w:val="VerbatimChar"/>
+        </w:rPr>
+        <w:t xml:space="preserve">    species.color = blue                # (or 'fillcolor')  The default fill color for all species in the layout</w:t>
+      </w:r>
+      <w:r>
+        <w:br/>
+      </w:r>
+      <w:r>
+        <w:rPr>
+          <w:rStyle w:val="VerbatimChar"/>
+        </w:rPr>
+        <w:t xml:space="preserve">    species.linecolor = orange          # (or 'strokecolor')  The default line color for all species in the layout</w:t>
+      </w:r>
+      <w:r>
+        <w:br/>
+      </w:r>
+      <w:r>
+        <w:rPr>
+          <w:rStyle w:val="VerbatimChar"/>
+        </w:rPr>
+        <w:t xml:space="preserve">    species.linewidth = 11              # (or 'strokewidth')  The default linewidth for all species in the layout</w:t>
+      </w:r>
+      <w:r>
+        <w:br/>
+      </w:r>
+      <w:r>
+        <w:rPr>
+          <w:rStyle w:val="VerbatimChar"/>
+        </w:rPr>
+        <w:t xml:space="preserve">    species.fontcolor = green           # The default font color for all species in the layout</w:t>
+      </w:r>
+      <w:r>
+        <w:br/>
+      </w:r>
+      <w:r>
+        <w:rPr>
+          <w:rStyle w:val="VerbatimChar"/>
+        </w:rPr>
+        <w:t xml:space="preserve">    species.font = sans_serif           # The default font for all species in the layout (predefined options are 'serif' (default), 'sans_serif', and 'monospace', but arbitrary font names are also legal.)</w:t>
+      </w:r>
+      <w:r>
+        <w:br/>
+      </w:r>
+      <w:r>
+        <w:rPr>
+          <w:rStyle w:val="VerbatimChar"/>
+        </w:rPr>
+        <w:t xml:space="preserve">    species.fontsize = 8                # The default font size for all species in the layout (default 10)</w:t>
+      </w:r>
+      <w:r>
+        <w:br/>
+      </w:r>
+      <w:r>
+        <w:rPr>
+          <w:rStyle w:val="VerbatimChar"/>
+        </w:rPr>
+        <w:t xml:space="preserve">    species.fontstyle = bold_italic     # (or 'fontweight')  The default font style for all species in the layout (options are 'normal' (default), 'bold', 'italic', and 'bold_italic').</w:t>
+      </w:r>
+      <w:r>
+        <w:br/>
+      </w:r>
+      <w:r>
+        <w:rPr>
+          <w:rStyle w:val="VerbatimChar"/>
+        </w:rPr>
+        <w:t xml:space="preserve">    species.shape = ellipse             # The default shape for all species in the layout (options are 'rectangle' (default), 'square', 'ellipse', 'circle', 'triangle', 'diamond', 'pentagon', 'hexagon', and 'octagon').</w:t>
+      </w:r>
+      <w:r>
+        <w:br/>
+      </w:r>
+      <w:r>
+        <w:br/>
+      </w:r>
+      <w:r>
+        <w:rPr>
+          <w:rStyle w:val="VerbatimChar"/>
+        </w:rPr>
+        <w:t xml:space="preserve">    # Individual species options:</w:t>
+      </w:r>
+      <w:r>
+        <w:br/>
+      </w:r>
+      <w:r>
+        <w:rPr>
+          <w:rStyle w:val="VerbatimChar"/>
+        </w:rPr>
+        <w:t xml:space="preserve">    S1.pos = {28, 35}                   # The position (x, y) of S1 in the layout.  By default, determined by autolayout.</w:t>
+      </w:r>
+      <w:r>
+        <w:br/>
+      </w:r>
+      <w:r>
+        <w:rPr>
+          <w:rStyle w:val="VerbatimChar"/>
+        </w:rPr>
+        <w:t xml:space="preserve">    S1.x = 28                           # (alt for pos) The x position of S1.</w:t>
+      </w:r>
+      <w:r>
+        <w:br/>
+      </w:r>
+      <w:r>
+        <w:rPr>
+          <w:rStyle w:val="VerbatimChar"/>
+        </w:rPr>
+        <w:t xml:space="preserve">    S1.y = 35                           # (alt for pos) The y position of S1.</w:t>
+      </w:r>
+      <w:r>
+        <w:br/>
+      </w:r>
+      <w:r>
+        <w:br/>
+      </w:r>
+      <w:r>
+        <w:rPr>
+          <w:rStyle w:val="VerbatimChar"/>
+        </w:rPr>
+        <w:t xml:space="preserve">    # Species options that override general species options:</w:t>
+      </w:r>
+      <w:r>
+        <w:br/>
+      </w:r>
+      <w:r>
+        <w:rPr>
+          <w:rStyle w:val="VerbatimChar"/>
+        </w:rPr>
+        <w:t xml:space="preserve">    S1.size = {55, 66}      # The size (width, height) of S1.  </w:t>
+      </w:r>
+      <w:r>
+        <w:br/>
+      </w:r>
+      <w:r>
+        <w:rPr>
+          <w:rStyle w:val="VerbatimChar"/>
+        </w:rPr>
+        <w:t xml:space="preserve">    S1.width = 55           # (alt for size). The width of S1.</w:t>
+      </w:r>
+      <w:r>
+        <w:br/>
+      </w:r>
+      <w:r>
+        <w:rPr>
+          <w:rStyle w:val="VerbatimChar"/>
+        </w:rPr>
+        <w:t xml:space="preserve">    S1.height = 66          # (alt for size). The height of S1.</w:t>
+      </w:r>
+      <w:r>
+        <w:br/>
+      </w:r>
+      <w:r>
+        <w:rPr>
+          <w:rStyle w:val="VerbatimChar"/>
+        </w:rPr>
+        <w:t xml:space="preserve">    S1.color = magenta      # (or 'fillcolor')  The fill color for S1</w:t>
+      </w:r>
+      <w:r>
+        <w:br/>
+      </w:r>
+      <w:r>
+        <w:rPr>
+          <w:rStyle w:val="VerbatimChar"/>
+        </w:rPr>
+        <w:t xml:space="preserve">    S1.linecolor = yellow   # (or 'strokecolor')  The line color for S1</w:t>
+      </w:r>
+      <w:r>
+        <w:br/>
+      </w:r>
+      <w:r>
+        <w:rPr>
+          <w:rStyle w:val="VerbatimChar"/>
+        </w:rPr>
+        <w:t xml:space="preserve">    S1.linewidth = 18       # (or 'strokewidth')  The linewidth for S1</w:t>
+      </w:r>
+      <w:r>
+        <w:br/>
+      </w:r>
+      <w:r>
+        <w:rPr>
+          <w:rStyle w:val="VerbatimChar"/>
+        </w:rPr>
+        <w:t xml:space="preserve">    S1.fontcolor = gray     # The font color for S1</w:t>
+      </w:r>
+      <w:r>
+        <w:br/>
+      </w:r>
+      <w:r>
+        <w:rPr>
+          <w:rStyle w:val="VerbatimChar"/>
+        </w:rPr>
+        <w:t xml:space="preserve">    S1.font = serif         # The font for S1 (predefined options are 'serif' (default), 'sans_serif', and 'monospace', but arbitrary font names are also legal.)</w:t>
+      </w:r>
+      <w:r>
+        <w:br/>
+      </w:r>
+      <w:r>
+        <w:rPr>
+          <w:rStyle w:val="VerbatimChar"/>
+        </w:rPr>
+        <w:t xml:space="preserve">    S1.fontsize = 19        # The font size for S1 (default 10)</w:t>
+      </w:r>
+      <w:r>
+        <w:br/>
+      </w:r>
+      <w:r>
+        <w:rPr>
+          <w:rStyle w:val="VerbatimChar"/>
+        </w:rPr>
+        <w:t xml:space="preserve">    S1.fontstyle = bold     # (or 'fontweight')  The font style for S1 (options are 'normal' (default), 'bold', 'italic', and 'bold_italic').</w:t>
+      </w:r>
+      <w:r>
+        <w:br/>
+      </w:r>
+      <w:r>
+        <w:rPr>
+          <w:rStyle w:val="VerbatimChar"/>
+        </w:rPr>
+        <w:t xml:space="preserve">    S1.shape = ellipse      # The shape for S1 (options are 'rectangle' (default), 'square', 'ellipse', 'circle', 'triangle', 'diamond', 'pentagon', 'hexagon', and 'octagon').</w:t>
+      </w:r>
+      <w:r>
+        <w:br/>
+      </w:r>
+      <w:r>
+        <w:br/>
+      </w:r>
+      <w:r>
+        <w:rPr>
+          <w:rStyle w:val="VerbatimChar"/>
+        </w:rPr>
+        <w:t xml:space="preserve">    J0.S1.species_end = {28, 34} # The position of the outer (species-side) end of the line between 'S1' and 'J0' (where J0 is the central point of the reaction)</w:t>
+      </w:r>
+      <w:r>
+        <w:br/>
+      </w:r>
+      <w:r>
+        <w:rPr>
+          <w:rStyle w:val="VerbatimChar"/>
+        </w:rPr>
+        <w:t xml:space="preserve">    J0.S1.b1  = {55, 31}         # The first control point for the line between S1 and J0.</w:t>
+      </w:r>
+      <w:r>
+        <w:br/>
+      </w:r>
+      <w:r>
+        <w:rPr>
+          <w:rStyle w:val="VerbatimChar"/>
+        </w:rPr>
+        <w:t xml:space="preserve">    J0.S1.b2  = {58, 25}         # The second control point for the line between S1 and J0.</w:t>
+      </w:r>
+      <w:r>
+        <w:br/>
+      </w:r>
+      <w:r>
+        <w:rPr>
+          <w:rStyle w:val="VerbatimChar"/>
+        </w:rPr>
+        <w:t xml:space="preserve">    J0.S1.rxn_end = {60, 24}     # The inner (reaction-side) end of the line between S1 and J0.  Usually not needed; the position is by default the position of the reaction itself.</w:t>
+      </w:r>
+      <w:r>
+        <w:br/>
+      </w:r>
+      <w:r>
+        <w:br/>
+      </w:r>
+      <w:r>
+        <w:br/>
+      </w:r>
+      <w:r>
+        <w:rPr>
+          <w:rStyle w:val="VerbatimChar"/>
+        </w:rPr>
+        <w:t xml:space="preserve">    #Align example:</w:t>
+      </w:r>
+      <w:r>
+        <w:br/>
+      </w:r>
+      <w:r>
+        <w:rPr>
+          <w:rStyle w:val="VerbatimChar"/>
+        </w:rPr>
+        <w:t xml:space="preserve">    S1-&gt;S2;</w:t>
+      </w:r>
+      <w:r>
+        <w:br/>
+      </w:r>
+      <w:r>
+        <w:rPr>
+          <w:rStyle w:val="VerbatimChar"/>
+        </w:rPr>
+        <w:t xml:space="preserve">    S2-&gt;S3;</w:t>
+      </w:r>
+      <w:r>
+        <w:br/>
+      </w:r>
+      <w:r>
+        <w:rPr>
+          <w:rStyle w:val="VerbatimChar"/>
+        </w:rPr>
+        <w:t xml:space="preserve">    S3-&gt;S4;</w:t>
+      </w:r>
+      <w:r>
+        <w:br/>
+      </w:r>
+      <w:r>
+        <w:rPr>
+          <w:rStyle w:val="VerbatimChar"/>
+        </w:rPr>
+        <w:t xml:space="preserve">    S4-&gt;S5; </w:t>
+      </w:r>
+      <w:r>
+        <w:br/>
+      </w:r>
+      <w:r>
+        <w:br/>
+      </w:r>
+      <w:r>
+        <w:rPr>
+          <w:rStyle w:val="VerbatimChar"/>
+        </w:rPr>
+        <w:t xml:space="preserve">    model.layout.align_top = {S1, S2, S3}</w:t>
+      </w:r>
+      <w:r>
+        <w:br/>
+      </w:r>
+      <w:r>
+        <w:rPr>
+          <w:rStyle w:val="VerbatimChar"/>
+        </w:rPr>
+        <w:t xml:space="preserve">    model.layout.align_right = {S3, S4, S5}</w:t>
+      </w:r>
+    </w:p>
     <w:bookmarkEnd w:id="89"/>
-    <w:bookmarkStart w:id="90" w:name="Xccd004f780dfc5c78c7be0d66e6d54c5c625bb3"/>
+    <w:bookmarkEnd w:id="90"/>
+    <w:bookmarkStart w:id="91" w:name="Xccd004f780dfc5c78c7be0d66e6d54c5c625bb3"/>
     <w:p>
       <w:pPr>
         <w:pStyle w:val="Heading2"/>
@@ -18907,8 +19488,8 @@
         <w:t xml:space="preserve">, etc.</w:t>
       </w:r>
     </w:p>
-    <w:bookmarkEnd w:id="90"/>
-    <w:bookmarkStart w:id="94" w:name="further-reading"/>
+    <w:bookmarkEnd w:id="91"/>
+    <w:bookmarkStart w:id="95" w:name="further-reading"/>
     <w:p>
       <w:pPr>
         <w:pStyle w:val="Heading2"/>
@@ -18931,7 +19512,7 @@
       <w:r>
         <w:t xml:space="preserve"> </w:t>
       </w:r>
-      <w:hyperlink r:id="rId91">
+      <w:hyperlink r:id="rId92">
         <w:r>
           <w:rPr>
             <w:rStyle w:val="Hyperlink"/>
@@ -18966,7 +19547,7 @@
       <w:r>
         <w:t xml:space="preserve"> </w:t>
       </w:r>
-      <w:hyperlink r:id="rId92">
+      <w:hyperlink r:id="rId93">
         <w:r>
           <w:rPr>
             <w:rStyle w:val="Hyperlink"/>
@@ -18998,7 +19579,7 @@
           <w:numId w:val="1016"/>
         </w:numPr>
       </w:pPr>
-      <w:hyperlink r:id="rId93">
+      <w:hyperlink r:id="rId94">
         <w:r>
           <w:rPr>
             <w:rStyle w:val="Hyperlink"/>
@@ -19019,8 +19600,8 @@
         <w:t xml:space="preserve">PDF format.</w:t>
       </w:r>
     </w:p>
-    <w:bookmarkEnd w:id="94"/>
     <w:bookmarkEnd w:id="95"/>
+    <w:bookmarkEnd w:id="96"/>
     <w:sectPr>
       <w:footnotePr>
         <w:numRestart w:val="eachSect"/>

</xml_diff>